<commit_message>
Cite Park YW et al. (Korean J Radiol 2026, in press) as figure source; add vorasidenib approval dates
Co-Authored-By: Claude Opus 5.5 <noreply@anthropic.com>
Claude-Session: https://claude.ai/code/session_01PzFoykbWyEoGX1gUoZrhXb
</commit_message>
<xml_diff>
--- a/cIMPACT-NOW_update12_학습노트.docx
+++ b/cIMPACT-NOW_update12_학습노트.docx
@@ -207,7 +207,21 @@
               <w:rPr>
                 <w:rFonts w:ascii="Malgun Gothic" w:cs="Malgun Gothic" w:eastAsia="Malgun Gothic" w:hAnsi="Malgun Gothic"/>
               </w:rPr>
-              <w:t xml:space="preserve">Grading 알고리즘 그림은 발표 슬라이드에 사용한 Fig. 2(cIMPACT-NOW update 12 schematic)를 기준으로 정리. 그 Figure가 실린 2차 리뷰 논문 자체는 검색으로 특정하지 못함.</w:t>
+              <w:t xml:space="preserve">Grading 알고리즘 그림 출처: </w:t>
+            </w:r>
+            <w:r>
+              <w:rPr>
+                <w:rFonts w:ascii="Malgun Gothic" w:cs="Malgun Gothic" w:eastAsia="Malgun Gothic" w:hAnsi="Malgun Gothic"/>
+                <w:b/>
+                <w:bCs/>
+              </w:rPr>
+              <w:t xml:space="preserve">Park YW, Wagner A, Karschnia P, Vollmuth P, Sahm F, Ahn SS, Kim HS, Park JE. Imaging of IDH-Mutant Gliomas in the Era of IDH Inhibitors: What Radiologists Need to Know. Korean J Radiol 2026 (in press; accepted 2026-08-06)</w:t>
+            </w:r>
+            <w:r>
+              <w:rPr>
+                <w:rFonts w:ascii="Malgun Gothic" w:cs="Malgun Gothic" w:eastAsia="Malgun Gothic" w:hAnsi="Malgun Gothic"/>
+              </w:rPr>
+              <w:t xml:space="preserve"> Fig. 2. 아직 PubMed 미등재 → 권·호·쪽·DOI는 출판 후 확인 필요. 이 노트에는 사용자가 제공한 첫 두 쪽과 Fig. 2만 반영.</w:t>
             </w:r>
           </w:p>
           <w:p>
@@ -656,7 +670,7 @@
           </w:pPr>
           <w:hyperlink w:history="1" w:anchor="_Toc14">
             <w:r>
-              <w:t xml:space="preserve">4-2. Grading 알고리즘 (Fig. 2 기준)</w:t>
+              <w:t xml:space="preserve">4-2. Grading 알고리즘 (Park YW, KJR 2026, Fig. 2)</w:t>
             </w:r>
             <w:r>
               <w:tab/>
@@ -4764,7 +4778,7 @@
         <w:rPr>
           <w:rFonts w:ascii="Malgun Gothic" w:cs="Malgun Gothic" w:eastAsia="Malgun Gothic" w:hAnsi="Malgun Gothic"/>
         </w:rPr>
-        <w:t xml:space="preserve">4-2. Grading 알고리즘 (Fig. 2 기준)</w:t>
+        <w:t xml:space="preserve">4-2. Grading 알고리즘 (Park YW, KJR 2026, Fig. 2)</w:t>
       </w:r>
       <w:bookmarkEnd w:id="14"/>
     </w:p>
@@ -5604,7 +5618,7 @@
           <w:sz w:val="18"/>
           <w:szCs w:val="18"/>
         </w:rPr>
-        <w:t xml:space="preserve">출처: Brat 2026 (PubMed abstract); Fig. 2 schematic(발표용 그림); Richardson 2026 (PMC13391642) Supplemental Table 기술</w:t>
+        <w:t xml:space="preserve">출처: Brat 2026 (PubMed abstract); Park YW, Korean J Radiol 2026 (in press) Fig. 2; Richardson 2026 (PMC13391642) Supplemental Table 기술</w:t>
       </w:r>
     </w:p>
     <w:p>
@@ -11205,6 +11219,66 @@
         <w:rPr>
           <w:rFonts w:ascii="Malgun Gothic" w:cs="Malgun Gothic" w:eastAsia="Malgun Gothic" w:hAnsi="Malgun Gothic"/>
         </w:rPr>
+        <w:t xml:space="preserve">허가: </w:t>
+      </w:r>
+      <w:r>
+        <w:rPr>
+          <w:rFonts w:ascii="Malgun Gothic" w:cs="Malgun Gothic" w:eastAsia="Malgun Gothic" w:hAnsi="Malgun Gothic"/>
+          <w:b/>
+          <w:bCs/>
+        </w:rPr>
+        <w:t xml:space="preserve">미국 FDA 2024년 8월</w:t>
+      </w:r>
+      <w:r>
+        <w:rPr>
+          <w:rFonts w:ascii="Malgun Gothic" w:cs="Malgun Gothic" w:eastAsia="Malgun Gothic" w:hAnsi="Malgun Gothic"/>
+        </w:rPr>
+        <w:t xml:space="preserve">, </w:t>
+      </w:r>
+      <w:r>
+        <w:rPr>
+          <w:rFonts w:ascii="Malgun Gothic" w:cs="Malgun Gothic" w:eastAsia="Malgun Gothic" w:hAnsi="Malgun Gothic"/>
+          <w:b/>
+          <w:bCs/>
+        </w:rPr>
+        <w:t xml:space="preserve">국내 식약처(MFDS) 2026년 1월</w:t>
+      </w:r>
+      <w:r>
+        <w:rPr>
+          <w:rFonts w:ascii="Malgun Gothic" w:cs="Malgun Gothic" w:eastAsia="Malgun Gothic" w:hAnsi="Malgun Gothic"/>
+        </w:rPr>
+        <w:t xml:space="preserve"> → grade 2 IDH-mutant glioma의 치료가 수술 후 'watch-and-wait'에서 IDH inhibitor로 이동</w:t>
+      </w:r>
+    </w:p>
+    <w:p>
+      <w:pPr>
+        <w:pStyle w:val="ListParagraph"/>
+        <w:numPr>
+          <w:ilvl w:val="0"/>
+          <w:numId w:val="2"/>
+        </w:numPr>
+        <w:spacing w:after="60" w:line="290"/>
+      </w:pPr>
+      <w:r>
+        <w:rPr>
+          <w:rFonts w:ascii="Malgun Gothic" w:cs="Malgun Gothic" w:eastAsia="Malgun Gothic" w:hAnsi="Malgun Gothic"/>
+        </w:rPr>
+        <w:t xml:space="preserve">IDH-mutant glioma 치료에서 약 20년 만의 첫 주요 치료적 진전으로 평가 → 초기 진단·추적 영상 해석의 중요성 증가</w:t>
+      </w:r>
+    </w:p>
+    <w:p>
+      <w:pPr>
+        <w:pStyle w:val="ListParagraph"/>
+        <w:numPr>
+          <w:ilvl w:val="0"/>
+          <w:numId w:val="2"/>
+        </w:numPr>
+        <w:spacing w:after="60" w:line="290"/>
+      </w:pPr>
+      <w:r>
+        <w:rPr>
+          <w:rFonts w:ascii="Malgun Gothic" w:cs="Malgun Gothic" w:eastAsia="Malgun Gothic" w:hAnsi="Malgun Gothic"/>
+        </w:rPr>
         <w:t xml:space="preserve">→ </w:t>
       </w:r>
       <w:r>
@@ -11260,7 +11334,7 @@
           <w:sz w:val="18"/>
           <w:szCs w:val="18"/>
         </w:rPr>
-        <w:t xml:space="preserve">출처: Mellinghoff, NEJM 2023;389:589 (10.1056/NEJMoa2304194); Wu, Curr Treat Options Oncol 2026 (abstract)</w:t>
+        <w:t xml:space="preserve">출처: Mellinghoff, NEJM 2023;389:589 (10.1056/NEJMoa2304194); Park YW, Korean J Radiol 2026 (in press) Introduction; Wu, Curr Treat Options Oncol 2026 (abstract)</w:t>
       </w:r>
     </w:p>
     <w:p>
@@ -13624,7 +13698,7 @@
               <w:rPr>
                 <w:rFonts w:ascii="Malgun Gothic" w:cs="Malgun Gothic" w:eastAsia="Malgun Gothic" w:hAnsi="Malgun Gothic"/>
               </w:rPr>
-              <w:t xml:space="preserve">Brat 2026</w:t>
+              <w:t xml:space="preserve">Brat 2026; 그림 Park YW, KJR 2026</w:t>
             </w:r>
           </w:p>
         </w:tc>
@@ -14496,6 +14570,24 @@
           <w:szCs w:val="18"/>
         </w:rPr>
         <w:t xml:space="preserve">Weller M, et al. EANO guidelines on the diagnosis and treatment of diffuse gliomas of adulthood. Nat Rev Clin Oncol 2021;18:170–186. doi:10.1038/s41571-020-00447-z</w:t>
+      </w:r>
+    </w:p>
+    <w:p>
+      <w:pPr>
+        <w:pStyle w:val="ListParagraph"/>
+        <w:numPr>
+          <w:ilvl w:val="0"/>
+          <w:numId w:val="3"/>
+        </w:numPr>
+        <w:spacing w:after="40"/>
+      </w:pPr>
+      <w:r>
+        <w:rPr>
+          <w:rFonts w:ascii="Malgun Gothic" w:cs="Malgun Gothic" w:eastAsia="Malgun Gothic" w:hAnsi="Malgun Gothic"/>
+          <w:sz w:val="18"/>
+          <w:szCs w:val="18"/>
+        </w:rPr>
+        <w:t xml:space="preserve">Park YW, Wagner A, Karschnia P, Vollmuth P, Sahm F, Ahn SS, Kim HS, Park JE. Imaging of isocitrate dehydrogenase-mutant gliomas in the era of isocitrate dehydrogenase inhibitors: what radiologists need to know. Korean J Radiol 2026 (in press; accepted Aug 6, 2026). [Fig. 2 = Update 12 grading schematic]</w:t>
       </w:r>
     </w:p>
     <w:p>

</xml_diff>